<commit_message>
update few code for video generation of governance app
</commit_message>
<xml_diff>
--- a/GOVERNANCE_EXPANSION_PROPOSAL.docx
+++ b/GOVERNANCE_EXPANSION_PROPOSAL.docx
@@ -541,7 +541,88 @@
         <w:pStyle w:val="Heading2"/>
       </w:pPr>
       <w:r>
+        <w:t>2.0 Read This First: A Plain-English Scenario</w:t>
+      </w:r>
+    </w:p>
+    <w:p>
+      <w:pPr/>
+      <w:r>
+        <w:rPr>
+          <w:i/>
+        </w:rPr>
+        <w:t>Every feature below reads more clearly against one running example than against six abstract ones. This section sets up a fictional company; each feature section that follows opens with an “In practice at Solstice” paragraph showing exactly what that company would see once the feature is live. The numbered technical options underneath are for the engineering team — the paragraph above them is what to hand to anyone else, including a manager or a client.</w:t>
+      </w:r>
+    </w:p>
+    <w:p>
+      <w:pPr/>
+      <w:r>
+        <w:rPr>
+          <w:b/>
+        </w:rPr>
+        <w:t>Solstice Retail Co.</w:t>
+      </w:r>
+      <w:r>
+        <w:t xml:space="preserve"> is a fictional mid-size retailer — about 600 employees — that has connected two internal tools to the AI Request Gateway described in Part 1:</w:t>
+      </w:r>
+    </w:p>
+    <w:p>
+      <w:pPr>
+        <w:pStyle w:val="ListBullet"/>
+      </w:pPr>
+      <w:r>
+        <w:rPr>
+          <w:b/>
+        </w:rPr>
+        <w:t>Shopper Assist</w:t>
+      </w:r>
+      <w:r>
+        <w:t xml:space="preserve"> — a customer-facing chatbot on the website, handling roughly 50,000 conversations a month and answering shipping, billing, and returns questions using a premium AI model.</w:t>
+      </w:r>
+    </w:p>
+    <w:p>
+      <w:pPr>
+        <w:pStyle w:val="ListBullet"/>
+      </w:pPr>
+      <w:r>
+        <w:rPr>
+          <w:b/>
+        </w:rPr>
+        <w:t>Compliance Review</w:t>
+      </w:r>
+      <w:r>
+        <w:t xml:space="preserve"> — an internal tool Legal and HR use to summarize supplier contracts and policy PDFs. Lower volume (about 2,000 requests a month), but each request attaches a long document, so it's expensive per call.</w:t>
+      </w:r>
+    </w:p>
+    <w:p>
+      <w:pPr/>
+      <w:r>
+        <w:rPr>
+          <w:b/>
+        </w:rPr>
+        <w:t>One more wrinkle:</w:t>
+      </w:r>
+      <w:r>
+        <w:t xml:space="preserve"> Solstice's consulting arm resells a version of Shopper Assist to two outside retail clients. Their traffic runs through the same kind of gateway but must never mix with Solstice's own data or with each other's — a constraint that matters most in sections 2.4 and 2.5 below.</w:t>
+      </w:r>
+    </w:p>
+    <w:p>
+      <w:pPr>
+        <w:pStyle w:val="Heading2"/>
+      </w:pPr>
+      <w:r>
         <w:t>2.1 Per-Project / Per-User Token Analysis</w:t>
+      </w:r>
+    </w:p>
+    <w:p>
+      <w:pPr/>
+      <w:r>
+        <w:rPr>
+          <w:b/>
+        </w:rPr>
+        <w:t>In practice at Solstice —</w:t>
+      </w:r>
+      <w:r>
+        <w:t xml:space="preserve"> Finance opens the dashboard and sees Compliance Review's AI spend jumped 300% in the past week — a jump big enough to alarm anyone, technical or not. Because usage is tracked down to the individual person, not just the project as a whole, drilling in shows the entire spike traces to one HR analyst who re-ran a 40-page supplier contract through the AI 60 times in an afternoon while testing different questions. IT reaches out to that one person instead of freezing AI access for all of Legal and HR — the issue is understood and resolved the same day, with a concrete name and a concrete number instead of a vague budget scare.</w:t>
       </w:r>
     </w:p>
     <w:p>
@@ -623,6 +704,51 @@
       </w:r>
     </w:p>
     <w:p>
+      <w:pPr/>
+      <w:r>
+        <w:rPr>
+          <w:b/>
+        </w:rPr>
+        <w:t>In practice at Solstice —</w:t>
+      </w:r>
+      <w:r>
+        <w:t xml:space="preserve"> the engine reviews a week of traffic and produces three tips, each one a plain sentence anyone can act on without opening a single line of code:</w:t>
+      </w:r>
+    </w:p>
+    <w:p>
+      <w:pPr>
+        <w:pStyle w:val="ListBullet"/>
+      </w:pPr>
+      <w:r>
+        <w:t>“Shopper Assist is using a $2.50-per-million-token model just to sort messages into Billing, Shipping, or Returns. A model built for simple tasks costs $0.15 per million tokens and does the same job for about 94% less.”</w:t>
+      </w:r>
+    </w:p>
+    <w:p>
+      <w:pPr>
+        <w:pStyle w:val="ListBullet"/>
+      </w:pPr>
+      <w:r>
+        <w:t>“Compliance Review re-sends the same 15,000-word supplier contract with every question asked about it. Turning on prompt caching lets the model reuse that document instead of re-reading it each time — roughly a 90% cut on that portion of the bill.”</w:t>
+      </w:r>
+    </w:p>
+    <w:p>
+      <w:pPr>
+        <w:pStyle w:val="ListBullet"/>
+      </w:pPr>
+      <w:r>
+        <w:t>“During Tuesday's checkout outage, 200 different customers asked some version of ‘is checkout down?’ within ten minutes — 200 separate AI calls for what was really one question, and a candidate for reusing a single answer instead of paying for it 200 times.”</w:t>
+      </w:r>
+    </w:p>
+    <w:p>
+      <w:pPr/>
+      <w:r>
+        <w:rPr>
+          <w:i/>
+        </w:rPr>
+        <w:t>Each tip names the project, the exact behavior, and the dollar impact — no chart-reading required.</w:t>
+      </w:r>
+    </w:p>
+    <w:p>
       <w:pPr>
         <w:pStyle w:val="ListNumber"/>
       </w:pPr>
@@ -701,6 +827,257 @@
       </w:r>
     </w:p>
     <w:p>
+      <w:pPr/>
+      <w:r>
+        <w:rPr>
+          <w:b/>
+        </w:rPr>
+        <w:t>In practice at Solstice —</w:t>
+      </w:r>
+      <w:r>
+        <w:t xml:space="preserve"> once the three tips from 2.2 are switched on, the counter tallies actual, confirmed savings — not a projection of what might happen, but what already did:</w:t>
+      </w:r>
+    </w:p>
+    <w:tbl>
+      <w:tblPr>
+        <w:tblStyle w:val="LightGrid-Accent1"/>
+        <w:tblW w:type="auto" w:w="0"/>
+        <w:tblLook w:firstColumn="1" w:firstRow="1" w:lastColumn="0" w:lastRow="0" w:noHBand="0" w:noVBand="1" w:val="04A0"/>
+      </w:tblPr>
+      <w:tblGrid>
+        <w:gridCol w:w="2160"/>
+        <w:gridCol w:w="2160"/>
+        <w:gridCol w:w="2160"/>
+        <w:gridCol w:w="2160"/>
+      </w:tblGrid>
+      <w:tr>
+        <w:tc>
+          <w:tcPr>
+            <w:tcW w:type="dxa" w:w="2160"/>
+          </w:tcPr>
+          <w:p>
+            <w:r>
+              <w:t>Change made</w:t>
+            </w:r>
+          </w:p>
+        </w:tc>
+        <w:tc>
+          <w:tcPr>
+            <w:tcW w:type="dxa" w:w="2160"/>
+          </w:tcPr>
+          <w:p>
+            <w:r>
+              <w:t>Volume</w:t>
+            </w:r>
+          </w:p>
+        </w:tc>
+        <w:tc>
+          <w:tcPr>
+            <w:tcW w:type="dxa" w:w="2160"/>
+          </w:tcPr>
+          <w:p>
+            <w:r>
+              <w:t>Cost before → after</w:t>
+            </w:r>
+          </w:p>
+        </w:tc>
+        <w:tc>
+          <w:tcPr>
+            <w:tcW w:type="dxa" w:w="2160"/>
+          </w:tcPr>
+          <w:p>
+            <w:r>
+              <w:t>Savings</w:t>
+            </w:r>
+          </w:p>
+        </w:tc>
+      </w:tr>
+      <w:tr>
+        <w:tc>
+          <w:tcPr>
+            <w:tcW w:type="dxa" w:w="2160"/>
+          </w:tcPr>
+          <w:p>
+            <w:r>
+              <w:t>Switched Shopper Assist's message-sorting step to a cheaper model</w:t>
+            </w:r>
+          </w:p>
+        </w:tc>
+        <w:tc>
+          <w:tcPr>
+            <w:tcW w:type="dxa" w:w="2160"/>
+          </w:tcPr>
+          <w:p>
+            <w:r>
+              <w:t>500,000 input + 50,000 output tokens / week</w:t>
+            </w:r>
+          </w:p>
+        </w:tc>
+        <w:tc>
+          <w:tcPr>
+            <w:tcW w:type="dxa" w:w="2160"/>
+          </w:tcPr>
+          <w:p>
+            <w:r>
+              <w:t>$1.75 → $0.11</w:t>
+            </w:r>
+          </w:p>
+        </w:tc>
+        <w:tc>
+          <w:tcPr>
+            <w:tcW w:type="dxa" w:w="2160"/>
+          </w:tcPr>
+          <w:p>
+            <w:r>
+              <w:t>$1.64</w:t>
+            </w:r>
+          </w:p>
+        </w:tc>
+      </w:tr>
+      <w:tr>
+        <w:tc>
+          <w:tcPr>
+            <w:tcW w:type="dxa" w:w="2160"/>
+          </w:tcPr>
+          <w:p>
+            <w:r>
+              <w:t>Turned on prompt caching for Compliance Review's supplier contract</w:t>
+            </w:r>
+          </w:p>
+        </w:tc>
+        <w:tc>
+          <w:tcPr>
+            <w:tcW w:type="dxa" w:w="2160"/>
+          </w:tcPr>
+          <w:p>
+            <w:r>
+              <w:t>100 questions against the same 15,000-word contract</w:t>
+            </w:r>
+          </w:p>
+        </w:tc>
+        <w:tc>
+          <w:tcPr>
+            <w:tcW w:type="dxa" w:w="2160"/>
+          </w:tcPr>
+          <w:p>
+            <w:r>
+              <w:t>$4.50 → $0.45</w:t>
+            </w:r>
+          </w:p>
+        </w:tc>
+        <w:tc>
+          <w:tcPr>
+            <w:tcW w:type="dxa" w:w="2160"/>
+          </w:tcPr>
+          <w:p>
+            <w:r>
+              <w:t>$4.05</w:t>
+            </w:r>
+          </w:p>
+        </w:tc>
+      </w:tr>
+      <w:tr>
+        <w:tc>
+          <w:tcPr>
+            <w:tcW w:type="dxa" w:w="2160"/>
+          </w:tcPr>
+          <w:p>
+            <w:r>
+              <w:t>Reused one answer for the 200 “is checkout down?” messages during the outage</w:t>
+            </w:r>
+          </w:p>
+        </w:tc>
+        <w:tc>
+          <w:tcPr>
+            <w:tcW w:type="dxa" w:w="2160"/>
+          </w:tcPr>
+          <w:p>
+            <w:r>
+              <w:t>200 AI calls avoided</w:t>
+            </w:r>
+          </w:p>
+        </w:tc>
+        <w:tc>
+          <w:tcPr>
+            <w:tcW w:type="dxa" w:w="2160"/>
+          </w:tcPr>
+          <w:p>
+            <w:r>
+              <w:t>$0.80 → $0.00</w:t>
+            </w:r>
+          </w:p>
+        </w:tc>
+        <w:tc>
+          <w:tcPr>
+            <w:tcW w:type="dxa" w:w="2160"/>
+          </w:tcPr>
+          <w:p>
+            <w:r>
+              <w:t>$0.80</w:t>
+            </w:r>
+          </w:p>
+        </w:tc>
+      </w:tr>
+      <w:tr>
+        <w:tc>
+          <w:tcPr>
+            <w:tcW w:type="dxa" w:w="2160"/>
+          </w:tcPr>
+          <w:p>
+            <w:r>
+              <w:rPr>
+                <w:b/>
+              </w:rPr>
+              <w:t>Total this week</w:t>
+            </w:r>
+          </w:p>
+        </w:tc>
+        <w:tc>
+          <w:tcPr>
+            <w:tcW w:type="dxa" w:w="2160"/>
+          </w:tcPr>
+          <w:p>
+            <w:r>
+              <w:rPr>
+                <w:b/>
+              </w:rPr>
+            </w:r>
+          </w:p>
+        </w:tc>
+        <w:tc>
+          <w:tcPr>
+            <w:tcW w:type="dxa" w:w="2160"/>
+          </w:tcPr>
+          <w:p>
+            <w:r>
+              <w:rPr>
+                <w:b/>
+              </w:rPr>
+            </w:r>
+          </w:p>
+        </w:tc>
+        <w:tc>
+          <w:tcPr>
+            <w:tcW w:type="dxa" w:w="2160"/>
+          </w:tcPr>
+          <w:p>
+            <w:r>
+              <w:rPr>
+                <w:b/>
+              </w:rPr>
+              <w:t>$6.49</w:t>
+            </w:r>
+          </w:p>
+        </w:tc>
+      </w:tr>
+    </w:tbl>
+    <w:p>
+      <w:pPr/>
+      <w:r>
+        <w:t>That $6.49 came from two small tweaks and one outage, on just two projects. At Solstice's actual scale — dozens of projects, not two — the same pattern realistically compounds into real annual savings, and the dashboard's running total is the number leadership sees the moment they open it, not a figure someone calculates for a quarterly review.</w:t>
+      </w:r>
+    </w:p>
+    <w:p>
       <w:pPr>
         <w:pStyle w:val="ListNumber"/>
       </w:pPr>
@@ -776,6 +1153,18 @@
       </w:pPr>
       <w:r>
         <w:t>2.4 Multi-Model Support (Claude / Gemini / OpenAI)</w:t>
+      </w:r>
+    </w:p>
+    <w:p>
+      <w:pPr/>
+      <w:r>
+        <w:rPr>
+          <w:b/>
+        </w:rPr>
+        <w:t>In practice at Solstice —</w:t>
+      </w:r>
+      <w:r>
+        <w:t xml:space="preserve"> Shopper Assist's message-sorting step moves to a cheaper, faster model built for simple classification, while Compliance Review stays on a model with a large context window because it needs to read entire contracts in one pass. Both run through the same gateway, so both show up on the same dashboard, hit the same budget limits, and get scanned by the same sensitive-data checks — nobody on the finance or compliance team needs to know or care which company built which model. And because each of the two outside consulting clients gets its own isolated deployment with its own credentials, a pricing change or an outage at one AI provider never touches the other client's traffic.</w:t>
       </w:r>
     </w:p>
     <w:p>
@@ -865,6 +1254,18 @@
       </w:r>
     </w:p>
     <w:p>
+      <w:pPr/>
+      <w:r>
+        <w:rPr>
+          <w:b/>
+        </w:rPr>
+        <w:t>In practice at Solstice's consulting arm —</w:t>
+      </w:r>
+      <w:r>
+        <w:t xml:space="preserve"> instead of hosting one shared copy of the platform for both outside clients (which would mean their data touches the same database and the same servers), each client gets its own copy of the packaged image installed inside their own environment, licensed for 12 months. Fifteen days before a license expires, the admin dashboard shows a renewal banner; if it lapses, AI traffic keeps flowing safely under the existing rules while the analytics dashboard freezes — an incentive to renew that never puts the client's day-to-day operations at risk.</w:t>
+      </w:r>
+    </w:p>
+    <w:p>
       <w:pPr>
         <w:pStyle w:val="ListNumber"/>
       </w:pPr>
@@ -940,6 +1341,18 @@
       </w:pPr>
       <w:r>
         <w:t>2.6 Staying Expandable</w:t>
+      </w:r>
+    </w:p>
+    <w:p>
+      <w:pPr/>
+      <w:r>
+        <w:rPr>
+          <w:b/>
+        </w:rPr>
+        <w:t>In practice at Solstice —</w:t>
+      </w:r>
+      <w:r>
+        <w:t xml:space="preserve"> six months after launch, one of the consulting arm's clients asks for a model from a provider that wasn't part of the original build. Because each provider is a self-contained add-on rather than something wired into the core system, support for the new provider ships as a plug-in module — existing clients on the older set of providers notice nothing, and nobody has to touch or retest the code the rest of Solstice already depends on.</w:t>
       </w:r>
     </w:p>
     <w:p>
@@ -1037,6 +1450,322 @@
         <w:t>4. ...</w:t>
       </w:r>
     </w:p>
+    <w:p>
+      <w:pPr>
+        <w:pStyle w:val="Heading1"/>
+      </w:pPr>
+      <w:r>
+        <w:t>Appendix: Plain-English Glossary</w:t>
+      </w:r>
+    </w:p>
+    <w:tbl>
+      <w:tblPr>
+        <w:tblStyle w:val="LightGrid-Accent1"/>
+        <w:tblW w:type="auto" w:w="0"/>
+        <w:tblLook w:firstColumn="1" w:firstRow="1" w:lastColumn="0" w:lastRow="0" w:noHBand="0" w:noVBand="1" w:val="04A0"/>
+      </w:tblPr>
+      <w:tblGrid>
+        <w:gridCol w:w="4320"/>
+        <w:gridCol w:w="4320"/>
+      </w:tblGrid>
+      <w:tr>
+        <w:tc>
+          <w:tcPr>
+            <w:tcW w:type="dxa" w:w="4320"/>
+          </w:tcPr>
+          <w:p>
+            <w:r>
+              <w:t>Term</w:t>
+            </w:r>
+          </w:p>
+        </w:tc>
+        <w:tc>
+          <w:tcPr>
+            <w:tcW w:type="dxa" w:w="4320"/>
+          </w:tcPr>
+          <w:p>
+            <w:r>
+              <w:t>What it means</w:t>
+            </w:r>
+          </w:p>
+        </w:tc>
+      </w:tr>
+      <w:tr>
+        <w:tc>
+          <w:tcPr>
+            <w:tcW w:type="dxa" w:w="4320"/>
+          </w:tcPr>
+          <w:p>
+            <w:r>
+              <w:rPr>
+                <w:b/>
+              </w:rPr>
+              <w:t>Token</w:t>
+            </w:r>
+          </w:p>
+        </w:tc>
+        <w:tc>
+          <w:tcPr>
+            <w:tcW w:type="dxa" w:w="4320"/>
+          </w:tcPr>
+          <w:p>
+            <w:r>
+              <w:t>A small chunk of text (roughly ¾ of a word) that AI models read and generate. Providers charge by the token, which is why token counts drive cost.</w:t>
+            </w:r>
+          </w:p>
+        </w:tc>
+      </w:tr>
+      <w:tr>
+        <w:tc>
+          <w:tcPr>
+            <w:tcW w:type="dxa" w:w="4320"/>
+          </w:tcPr>
+          <w:p>
+            <w:r>
+              <w:rPr>
+                <w:b/>
+              </w:rPr>
+              <w:t>Proxy / Gateway</w:t>
+            </w:r>
+          </w:p>
+        </w:tc>
+        <w:tc>
+          <w:tcPr>
+            <w:tcW w:type="dxa" w:w="4320"/>
+          </w:tcPr>
+          <w:p>
+            <w:r>
+              <w:t>A checkpoint that every AI request passes through before reaching the AI provider, so the platform can inspect, log, and enforce rules on it — this is what Part 1 describes.</w:t>
+            </w:r>
+          </w:p>
+        </w:tc>
+      </w:tr>
+      <w:tr>
+        <w:tc>
+          <w:tcPr>
+            <w:tcW w:type="dxa" w:w="4320"/>
+          </w:tcPr>
+          <w:p>
+            <w:r>
+              <w:rPr>
+                <w:b/>
+              </w:rPr>
+              <w:t>API</w:t>
+            </w:r>
+          </w:p>
+        </w:tc>
+        <w:tc>
+          <w:tcPr>
+            <w:tcW w:type="dxa" w:w="4320"/>
+          </w:tcPr>
+          <w:p>
+            <w:r>
+              <w:t>The way one piece of software (like this platform) talks to another (like OpenAI, Anthropic, or Google) over the internet.</w:t>
+            </w:r>
+          </w:p>
+        </w:tc>
+      </w:tr>
+      <w:tr>
+        <w:tc>
+          <w:tcPr>
+            <w:tcW w:type="dxa" w:w="4320"/>
+          </w:tcPr>
+          <w:p>
+            <w:r>
+              <w:rPr>
+                <w:b/>
+              </w:rPr>
+              <w:t>PII</w:t>
+            </w:r>
+          </w:p>
+        </w:tc>
+        <w:tc>
+          <w:tcPr>
+            <w:tcW w:type="dxa" w:w="4320"/>
+          </w:tcPr>
+          <w:p>
+            <w:r>
+              <w:t>Personally Identifiable Information — things like names, emails, ID numbers, or financial details that need special handling to stay private.</w:t>
+            </w:r>
+          </w:p>
+        </w:tc>
+      </w:tr>
+      <w:tr>
+        <w:tc>
+          <w:tcPr>
+            <w:tcW w:type="dxa" w:w="4320"/>
+          </w:tcPr>
+          <w:p>
+            <w:r>
+              <w:rPr>
+                <w:b/>
+              </w:rPr>
+              <w:t>Prompt caching</w:t>
+            </w:r>
+          </w:p>
+        </w:tc>
+        <w:tc>
+          <w:tcPr>
+            <w:tcW w:type="dxa" w:w="4320"/>
+          </w:tcPr>
+          <w:p>
+            <w:r>
+              <w:t>Letting an AI model reuse a document or instruction it has already seen instead of being sent it fresh every time — much cheaper for repeated content.</w:t>
+            </w:r>
+          </w:p>
+        </w:tc>
+      </w:tr>
+      <w:tr>
+        <w:tc>
+          <w:tcPr>
+            <w:tcW w:type="dxa" w:w="4320"/>
+          </w:tcPr>
+          <w:p>
+            <w:r>
+              <w:rPr>
+                <w:b/>
+              </w:rPr>
+              <w:t>Rate limiting</w:t>
+            </w:r>
+          </w:p>
+        </w:tc>
+        <w:tc>
+          <w:tcPr>
+            <w:tcW w:type="dxa" w:w="4320"/>
+          </w:tcPr>
+          <w:p>
+            <w:r>
+              <w:t>A cap on how many requests or tokens a person or project can use in a given time window, to prevent runaway usage.</w:t>
+            </w:r>
+          </w:p>
+        </w:tc>
+      </w:tr>
+      <w:tr>
+        <w:tc>
+          <w:tcPr>
+            <w:tcW w:type="dxa" w:w="4320"/>
+          </w:tcPr>
+          <w:p>
+            <w:r>
+              <w:rPr>
+                <w:b/>
+              </w:rPr>
+              <w:t>Budget enforcement</w:t>
+            </w:r>
+          </w:p>
+        </w:tc>
+        <w:tc>
+          <w:tcPr>
+            <w:tcW w:type="dxa" w:w="4320"/>
+          </w:tcPr>
+          <w:p>
+            <w:r>
+              <w:t>Automatically warning or blocking further AI usage once a project or org crosses a spending limit for the month.</w:t>
+            </w:r>
+          </w:p>
+        </w:tc>
+      </w:tr>
+      <w:tr>
+        <w:tc>
+          <w:tcPr>
+            <w:tcW w:type="dxa" w:w="4320"/>
+          </w:tcPr>
+          <w:p>
+            <w:r>
+              <w:rPr>
+                <w:b/>
+              </w:rPr>
+              <w:t>License / expiry</w:t>
+            </w:r>
+          </w:p>
+        </w:tc>
+        <w:tc>
+          <w:tcPr>
+            <w:tcW w:type="dxa" w:w="4320"/>
+          </w:tcPr>
+          <w:p>
+            <w:r>
+              <w:t>A time-limited permission file bundled with the software; when it lapses, certain features pause until it's renewed — the same idea as a software subscription.</w:t>
+            </w:r>
+          </w:p>
+        </w:tc>
+      </w:tr>
+      <w:tr>
+        <w:tc>
+          <w:tcPr>
+            <w:tcW w:type="dxa" w:w="4320"/>
+          </w:tcPr>
+          <w:p>
+            <w:r>
+              <w:rPr>
+                <w:b/>
+              </w:rPr>
+              <w:t>Container image</w:t>
+            </w:r>
+          </w:p>
+        </w:tc>
+        <w:tc>
+          <w:tcPr>
+            <w:tcW w:type="dxa" w:w="4320"/>
+          </w:tcPr>
+          <w:p>
+            <w:r>
+              <w:t>A self-contained, ready-to-run package of the software and everything it needs, so it can be installed the same way in any environment.</w:t>
+            </w:r>
+          </w:p>
+        </w:tc>
+      </w:tr>
+      <w:tr>
+        <w:tc>
+          <w:tcPr>
+            <w:tcW w:type="dxa" w:w="4320"/>
+          </w:tcPr>
+          <w:p>
+            <w:r>
+              <w:rPr>
+                <w:b/>
+              </w:rPr>
+              <w:t>Model / LLM</w:t>
+            </w:r>
+          </w:p>
+        </w:tc>
+        <w:tc>
+          <w:tcPr>
+            <w:tcW w:type="dxa" w:w="4320"/>
+          </w:tcPr>
+          <w:p>
+            <w:r>
+              <w:t>The underlying AI (e.g. GPT-4o, Claude, Gemini) that actually reads a request and writes a response; different models vary a lot in cost and capability.</w:t>
+            </w:r>
+          </w:p>
+        </w:tc>
+      </w:tr>
+      <w:tr>
+        <w:tc>
+          <w:tcPr>
+            <w:tcW w:type="dxa" w:w="4320"/>
+          </w:tcPr>
+          <w:p>
+            <w:r>
+              <w:rPr>
+                <w:b/>
+              </w:rPr>
+              <w:t>Multi-tenant / isolation</w:t>
+            </w:r>
+          </w:p>
+        </w:tc>
+        <w:tc>
+          <w:tcPr>
+            <w:tcW w:type="dxa" w:w="4320"/>
+          </w:tcPr>
+          <w:p>
+            <w:r>
+              <w:t>Keeping each customer's or client's data and traffic completely separate from everyone else's, even though they may run the same software.</w:t>
+            </w:r>
+          </w:p>
+        </w:tc>
+      </w:tr>
+    </w:tbl>
     <w:sectPr>
       <w:pgSz w:w="12240" w:h="15840"/>
       <w:pgMar w:top="1440" w:right="1800" w:bottom="1440" w:left="1800" w:header="720" w:footer="720" w:gutter="0"/>

</xml_diff>